<commit_message>
Rename example final exam files
</commit_message>
<xml_diff>
--- a/Státnice.docx
+++ b/Státnice.docx
@@ -572,6 +572,14 @@
                 <w:szCs w:val="20"/>
               </w:rPr>
               <w:t>/2</w:t>
+            </w:r>
+            <w:r>
+              <w:rPr>
+                <w:color w:val="A6A6A6" w:themeColor="background1" w:themeShade="A6"/>
+                <w:sz w:val="20"/>
+                <w:szCs w:val="20"/>
+              </w:rPr>
+              <w:t xml:space="preserve"> </w:t>
             </w:r>
           </w:p>
         </w:tc>

</xml_diff>

<commit_message>
Restructure folders, improve index
</commit_message>
<xml_diff>
--- a/Státnice.docx
+++ b/Státnice.docx
@@ -523,6 +523,35 @@
               </w:rPr>
               <w:t>/2</w:t>
             </w:r>
+            <w:r>
+              <w:rPr>
+                <w:color w:val="A6A6A6" w:themeColor="background1" w:themeShade="A6"/>
+                <w:sz w:val="20"/>
+                <w:szCs w:val="20"/>
+              </w:rPr>
+              <w:t xml:space="preserve"> </w:t>
+            </w:r>
+            <w:r>
+              <w:rPr>
+                <w:sz w:val="20"/>
+                <w:szCs w:val="20"/>
+              </w:rPr>
+              <w:t>(</w:t>
+            </w:r>
+            <w:r>
+              <w:rPr>
+                <w:sz w:val="20"/>
+                <w:szCs w:val="20"/>
+              </w:rPr>
+              <w:t>okruh I ne, okruh II ano</w:t>
+            </w:r>
+            <w:r>
+              <w:rPr>
+                <w:sz w:val="20"/>
+                <w:szCs w:val="20"/>
+              </w:rPr>
+              <w:t>)</w:t>
+            </w:r>
           </w:p>
         </w:tc>
       </w:tr>
@@ -540,6 +569,7 @@
             </w:pPr>
             <w:r>
               <w:rPr>
+                <w:color w:val="BFBFBF" w:themeColor="background1" w:themeShade="BF"/>
                 <w:sz w:val="20"/>
                 <w:szCs w:val="20"/>
               </w:rPr>
@@ -560,22 +590,15 @@
             </w:pPr>
             <w:r>
               <w:rPr>
-                <w:sz w:val="20"/>
-                <w:szCs w:val="20"/>
-              </w:rPr>
-              <w:t>1</w:t>
+                <w:color w:val="BFBFBF" w:themeColor="background1" w:themeShade="BF"/>
+                <w:sz w:val="20"/>
+                <w:szCs w:val="20"/>
+              </w:rPr>
+              <w:t>2</w:t>
             </w:r>
             <w:r>
               <w:rPr>
-                <w:color w:val="A6A6A6" w:themeColor="background1" w:themeShade="A6"/>
-                <w:sz w:val="20"/>
-                <w:szCs w:val="20"/>
-              </w:rPr>
-              <w:t>/2</w:t>
-            </w:r>
-            <w:r>
-              <w:rPr>
-                <w:color w:val="A6A6A6" w:themeColor="background1" w:themeShade="A6"/>
+                <w:color w:val="BFBFBF" w:themeColor="background1" w:themeShade="BF"/>
                 <w:sz w:val="20"/>
                 <w:szCs w:val="20"/>
               </w:rPr>
@@ -598,7 +621,6 @@
             </w:pPr>
             <w:r>
               <w:rPr>
-                <w:color w:val="ADADAD" w:themeColor="background2" w:themeShade="BF"/>
                 <w:sz w:val="20"/>
                 <w:szCs w:val="20"/>
               </w:rPr>
@@ -619,7 +641,6 @@
             </w:pPr>
             <w:r>
               <w:rPr>
-                <w:color w:val="ADADAD" w:themeColor="background2" w:themeShade="BF"/>
                 <w:sz w:val="20"/>
                 <w:szCs w:val="20"/>
               </w:rPr>
@@ -720,12 +741,14 @@
           <w:p>
             <w:pPr>
               <w:rPr>
+                <w:color w:val="BFBFBF" w:themeColor="background1" w:themeShade="BF"/>
                 <w:sz w:val="20"/>
                 <w:szCs w:val="20"/>
               </w:rPr>
             </w:pPr>
             <w:r>
               <w:rPr>
+                <w:color w:val="BFBFBF" w:themeColor="background1" w:themeShade="BF"/>
                 <w:sz w:val="20"/>
                 <w:szCs w:val="20"/>
               </w:rPr>
@@ -740,12 +763,14 @@
           <w:p>
             <w:pPr>
               <w:rPr>
+                <w:color w:val="BFBFBF" w:themeColor="background1" w:themeShade="BF"/>
                 <w:sz w:val="20"/>
                 <w:szCs w:val="20"/>
               </w:rPr>
             </w:pPr>
             <w:r>
               <w:rPr>
+                <w:color w:val="BFBFBF" w:themeColor="background1" w:themeShade="BF"/>
                 <w:sz w:val="20"/>
                 <w:szCs w:val="20"/>
               </w:rPr>
@@ -810,7 +835,6 @@
             </w:pPr>
             <w:r>
               <w:rPr>
-                <w:color w:val="ADADAD" w:themeColor="background2" w:themeShade="BF"/>
                 <w:sz w:val="20"/>
                 <w:szCs w:val="20"/>
               </w:rPr>
@@ -831,7 +855,6 @@
             </w:pPr>
             <w:r>
               <w:rPr>
-                <w:color w:val="ADADAD" w:themeColor="background2" w:themeShade="BF"/>
                 <w:sz w:val="20"/>
                 <w:szCs w:val="20"/>
               </w:rPr>
@@ -1000,6 +1023,22 @@
                 <w:sz w:val="20"/>
                 <w:szCs w:val="20"/>
               </w:rPr>
+              <w:t>3</w:t>
+            </w:r>
+            <w:r>
+              <w:rPr>
+                <w:color w:val="BFBFBF" w:themeColor="background1" w:themeShade="BF"/>
+                <w:sz w:val="20"/>
+                <w:szCs w:val="20"/>
+              </w:rPr>
+              <w:t>/</w:t>
+            </w:r>
+            <w:r>
+              <w:rPr>
+                <w:color w:val="BFBFBF" w:themeColor="background1" w:themeShade="BF"/>
+                <w:sz w:val="20"/>
+                <w:szCs w:val="20"/>
+              </w:rPr>
               <w:t>5</w:t>
             </w:r>
           </w:p>
@@ -1298,124 +1337,6 @@
           <w:rPr>
             <w:rStyle w:val="Hypertextovodkaz"/>
           </w:rPr>
-          <w:t>Programování a softwarové inženýrství</w:t>
-        </w:r>
-      </w:hyperlink>
-    </w:p>
-    <w:p>
-      <w:pPr>
-        <w:pStyle w:val="Odstavecseseznamem"/>
-        <w:numPr>
-          <w:ilvl w:val="0"/>
-          <w:numId w:val="32"/>
-        </w:numPr>
-        <w:ind w:left="284" w:hanging="284"/>
-        <w:rPr>
-          <w:sz w:val="20"/>
-          <w:szCs w:val="20"/>
-        </w:rPr>
-      </w:pPr>
-      <w:r>
-        <w:rPr>
-          <w:sz w:val="20"/>
-          <w:szCs w:val="20"/>
-        </w:rPr>
-        <w:t>Objektově orientované návrhové vzory</w:t>
-      </w:r>
-    </w:p>
-    <w:p>
-      <w:pPr>
-        <w:pStyle w:val="Odstavecseseznamem"/>
-        <w:numPr>
-          <w:ilvl w:val="0"/>
-          <w:numId w:val="32"/>
-        </w:numPr>
-        <w:ind w:left="284" w:hanging="284"/>
-        <w:rPr>
-          <w:sz w:val="20"/>
-          <w:szCs w:val="20"/>
-        </w:rPr>
-      </w:pPr>
-      <w:r>
-        <w:rPr>
-          <w:sz w:val="20"/>
-          <w:szCs w:val="20"/>
-        </w:rPr>
-        <w:t>Vývoj desktopové aplikace</w:t>
-      </w:r>
-    </w:p>
-    <w:p>
-      <w:pPr>
-        <w:pStyle w:val="Odstavecseseznamem"/>
-        <w:numPr>
-          <w:ilvl w:val="0"/>
-          <w:numId w:val="32"/>
-        </w:numPr>
-        <w:ind w:left="284" w:hanging="284"/>
-        <w:rPr>
-          <w:sz w:val="20"/>
-          <w:szCs w:val="20"/>
-        </w:rPr>
-      </w:pPr>
-      <w:r>
-        <w:rPr>
-          <w:sz w:val="20"/>
-          <w:szCs w:val="20"/>
-        </w:rPr>
-        <w:t>Vývoj mobilní aplikace</w:t>
-      </w:r>
-    </w:p>
-    <w:p>
-      <w:pPr>
-        <w:pStyle w:val="Odstavecseseznamem"/>
-        <w:numPr>
-          <w:ilvl w:val="0"/>
-          <w:numId w:val="32"/>
-        </w:numPr>
-        <w:ind w:left="284" w:hanging="284"/>
-        <w:rPr>
-          <w:sz w:val="20"/>
-          <w:szCs w:val="20"/>
-        </w:rPr>
-      </w:pPr>
-      <w:r>
-        <w:rPr>
-          <w:sz w:val="20"/>
-          <w:szCs w:val="20"/>
-        </w:rPr>
-        <w:t>Vývoj webové aplikace</w:t>
-      </w:r>
-    </w:p>
-    <w:p>
-      <w:pPr>
-        <w:pStyle w:val="Odstavecseseznamem"/>
-        <w:numPr>
-          <w:ilvl w:val="0"/>
-          <w:numId w:val="32"/>
-        </w:numPr>
-        <w:ind w:left="284" w:hanging="284"/>
-        <w:rPr>
-          <w:sz w:val="20"/>
-          <w:szCs w:val="20"/>
-        </w:rPr>
-      </w:pPr>
-      <w:r>
-        <w:rPr>
-          <w:sz w:val="20"/>
-          <w:szCs w:val="20"/>
-        </w:rPr>
-        <w:t>Objektově orientovaný návrh</w:t>
-      </w:r>
-    </w:p>
-    <w:p>
-      <w:pPr>
-        <w:pStyle w:val="Nadpis2"/>
-      </w:pPr>
-      <w:hyperlink r:id="rId8" w:history="1">
-        <w:r>
-          <w:rPr>
-            <w:rStyle w:val="Hypertextovodkaz"/>
-          </w:rPr>
           <w:t>Databázové systémy a zpracování dat</w:t>
         </w:r>
       </w:hyperlink>
@@ -1454,12 +1375,21 @@
           <w:szCs w:val="20"/>
         </w:rPr>
       </w:pPr>
+      <w:proofErr w:type="spellStart"/>
       <w:r>
         <w:rPr>
           <w:sz w:val="20"/>
           <w:szCs w:val="20"/>
         </w:rPr>
-        <w:t>NoSQL databáze</w:t>
+        <w:t>NoSQL</w:t>
+      </w:r>
+      <w:proofErr w:type="spellEnd"/>
+      <w:r>
+        <w:rPr>
+          <w:sz w:val="20"/>
+          <w:szCs w:val="20"/>
+        </w:rPr>
+        <w:t xml:space="preserve"> databáze</w:t>
       </w:r>
     </w:p>
     <w:p>
@@ -1527,6 +1457,124 @@
           <w:szCs w:val="20"/>
         </w:rPr>
         <w:t>Počítačové zpracování signálu</w:t>
+      </w:r>
+    </w:p>
+    <w:p>
+      <w:pPr>
+        <w:pStyle w:val="Nadpis2"/>
+      </w:pPr>
+      <w:hyperlink r:id="rId8" w:history="1">
+        <w:r>
+          <w:rPr>
+            <w:rStyle w:val="Hypertextovodkaz"/>
+          </w:rPr>
+          <w:t>Programování a softwarové inženýrství</w:t>
+        </w:r>
+      </w:hyperlink>
+    </w:p>
+    <w:p>
+      <w:pPr>
+        <w:pStyle w:val="Odstavecseseznamem"/>
+        <w:numPr>
+          <w:ilvl w:val="0"/>
+          <w:numId w:val="32"/>
+        </w:numPr>
+        <w:ind w:left="284" w:hanging="284"/>
+        <w:rPr>
+          <w:sz w:val="20"/>
+          <w:szCs w:val="20"/>
+        </w:rPr>
+      </w:pPr>
+      <w:r>
+        <w:rPr>
+          <w:sz w:val="20"/>
+          <w:szCs w:val="20"/>
+        </w:rPr>
+        <w:t>Objektově orientované návrhové vzory</w:t>
+      </w:r>
+    </w:p>
+    <w:p>
+      <w:pPr>
+        <w:pStyle w:val="Odstavecseseznamem"/>
+        <w:numPr>
+          <w:ilvl w:val="0"/>
+          <w:numId w:val="32"/>
+        </w:numPr>
+        <w:ind w:left="284" w:hanging="284"/>
+        <w:rPr>
+          <w:sz w:val="20"/>
+          <w:szCs w:val="20"/>
+        </w:rPr>
+      </w:pPr>
+      <w:r>
+        <w:rPr>
+          <w:sz w:val="20"/>
+          <w:szCs w:val="20"/>
+        </w:rPr>
+        <w:t>Vývoj desktopové aplikace</w:t>
+      </w:r>
+    </w:p>
+    <w:p>
+      <w:pPr>
+        <w:pStyle w:val="Odstavecseseznamem"/>
+        <w:numPr>
+          <w:ilvl w:val="0"/>
+          <w:numId w:val="32"/>
+        </w:numPr>
+        <w:ind w:left="284" w:hanging="284"/>
+        <w:rPr>
+          <w:sz w:val="20"/>
+          <w:szCs w:val="20"/>
+        </w:rPr>
+      </w:pPr>
+      <w:r>
+        <w:rPr>
+          <w:sz w:val="20"/>
+          <w:szCs w:val="20"/>
+        </w:rPr>
+        <w:t>Vývoj mobilní aplikace</w:t>
+      </w:r>
+    </w:p>
+    <w:p>
+      <w:pPr>
+        <w:pStyle w:val="Odstavecseseznamem"/>
+        <w:numPr>
+          <w:ilvl w:val="0"/>
+          <w:numId w:val="32"/>
+        </w:numPr>
+        <w:ind w:left="284" w:hanging="284"/>
+        <w:rPr>
+          <w:sz w:val="20"/>
+          <w:szCs w:val="20"/>
+        </w:rPr>
+      </w:pPr>
+      <w:r>
+        <w:rPr>
+          <w:sz w:val="20"/>
+          <w:szCs w:val="20"/>
+        </w:rPr>
+        <w:t>Vývoj webové aplikace</w:t>
+      </w:r>
+    </w:p>
+    <w:p>
+      <w:pPr>
+        <w:pStyle w:val="Odstavecseseznamem"/>
+        <w:numPr>
+          <w:ilvl w:val="0"/>
+          <w:numId w:val="32"/>
+        </w:numPr>
+        <w:ind w:left="284" w:hanging="284"/>
+        <w:rPr>
+          <w:sz w:val="20"/>
+          <w:szCs w:val="20"/>
+        </w:rPr>
+      </w:pPr>
+      <w:r>
+        <w:rPr>
+          <w:sz w:val="20"/>
+          <w:szCs w:val="20"/>
+        </w:rPr>
+        <w:t>Objektově orientovaný návrh</w:t>
       </w:r>
     </w:p>
     <w:sectPr>

</xml_diff>